<commit_message>
Azauracil monohydrate and Amantadine Hydrochloride
</commit_message>
<xml_diff>
--- a/Azauracil/5-azauracil.docx
+++ b/Azauracil/5-azauracil.docx
@@ -14,6 +14,12 @@
           <w:lang w:val="en-US"/>
         </w:rPr>
         <w:t>5-azauracil</w:t>
+      </w:r>
+      <w:r>
+        <w:rPr>
+          <w:lang w:val="en-US"/>
+        </w:rPr>
+        <w:t xml:space="preserve"> and monohydrate</w:t>
       </w:r>
     </w:p>
     <w:p>
@@ -32,7 +38,7 @@
         <w:rPr>
           <w:lang w:val="en-US"/>
         </w:rPr>
-        <w:t>April</w:t>
+        <w:t>May</w:t>
       </w:r>
       <w:r>
         <w:rPr>
@@ -74,10 +80,10 @@
             <v:path o:extrusionok="f" gradientshapeok="t" o:connecttype="rect"/>
             <o:lock v:ext="edit" aspectratio="t"/>
           </v:shapetype>
-          <v:shape id="_x0000_i1027" type="#_x0000_t75" style="width:58.5pt;height:70.5pt" o:ole="">
+          <v:shape id="_x0000_i1025" type="#_x0000_t75" style="width:58.5pt;height:70.5pt" o:ole="">
             <v:imagedata r:id="rId6" o:title=""/>
           </v:shape>
-          <o:OLEObject Type="Embed" ProgID="ACD.ChemSketch.20" ShapeID="_x0000_i1027" DrawAspect="Content" ObjectID="_1838450639" r:id="rId7"/>
+          <o:OLEObject Type="Embed" ProgID="ACD.ChemSketch.20" ShapeID="_x0000_i1025" DrawAspect="Content" ObjectID="_1839671111" r:id="rId7"/>
         </w:object>
       </w:r>
     </w:p>
@@ -138,12 +144,13 @@
     <w:tbl>
       <w:tblPr>
         <w:tblStyle w:val="TableGrid"/>
-        <w:tblW w:w="0" w:type="auto"/>
+        <w:tblW w:w="10456" w:type="dxa"/>
+        <w:tblInd w:w="-25" w:type="dxa"/>
         <w:tblLook w:val="04A0" w:firstRow="1" w:lastRow="0" w:firstColumn="1" w:lastColumn="0" w:noHBand="0" w:noVBand="1"/>
       </w:tblPr>
       <w:tblGrid>
-        <w:gridCol w:w="3237"/>
-        <w:gridCol w:w="7169"/>
+        <w:gridCol w:w="3256"/>
+        <w:gridCol w:w="7200"/>
       </w:tblGrid>
       <w:tr>
         <w:tc>
@@ -380,16 +387,8 @@
               <w:rPr>
                 <w:lang w:val="en-US"/>
               </w:rPr>
-              <w:t xml:space="preserve">CSD </w:t>
-            </w:r>
-            <w:proofErr w:type="spellStart"/>
-            <w:r>
-              <w:rPr>
-                <w:lang w:val="en-US"/>
-              </w:rPr>
-              <w:t>Refcodes</w:t>
-            </w:r>
-            <w:proofErr w:type="spellEnd"/>
+              <w:t>CSD Refcodes</w:t>
+            </w:r>
           </w:p>
         </w:tc>
         <w:tc>
@@ -689,14 +688,12 @@
                 <w:lang w:val="en-US"/>
               </w:rPr>
             </w:pPr>
-            <w:proofErr w:type="spellStart"/>
             <w:r>
               <w:rPr>
                 <w:lang w:val="en-US"/>
               </w:rPr>
               <w:t>Study_ID</w:t>
             </w:r>
-            <w:proofErr w:type="spellEnd"/>
           </w:p>
         </w:tc>
         <w:tc>
@@ -848,21 +845,7 @@
               <w:rPr>
                 <w:lang w:val="en-US"/>
               </w:rPr>
-              <w:t>MP2 6-31G(</w:t>
-            </w:r>
-            <w:proofErr w:type="spellStart"/>
-            <w:r>
-              <w:rPr>
-                <w:lang w:val="en-US"/>
-              </w:rPr>
-              <w:t>d,p</w:t>
-            </w:r>
-            <w:proofErr w:type="spellEnd"/>
-            <w:r>
-              <w:rPr>
-                <w:lang w:val="en-US"/>
-              </w:rPr>
-              <w:t>) DMA +FIT</w:t>
+              <w:t>MP2 6-31G(d,p) DMA +FIT</w:t>
             </w:r>
           </w:p>
         </w:tc>
@@ -908,39 +891,529 @@
               <w:rPr>
                 <w:lang w:val="en-US"/>
               </w:rPr>
-              <w:t>MP2 6-31G(</w:t>
-            </w:r>
-            <w:proofErr w:type="spellStart"/>
-            <w:r>
-              <w:rPr>
-                <w:lang w:val="en-US"/>
-              </w:rPr>
-              <w:t>d,p</w:t>
-            </w:r>
-            <w:proofErr w:type="spellEnd"/>
-            <w:r>
-              <w:rPr>
-                <w:lang w:val="en-US"/>
-              </w:rPr>
-              <w:t xml:space="preserve">) </w:t>
-            </w:r>
-            <w:r>
-              <w:rPr>
-                <w:lang w:val="en-US"/>
-              </w:rPr>
-              <w:t>optimized</w:t>
+              <w:t>MP2 6-31G(d,p) optimized</w:t>
+            </w:r>
+          </w:p>
+        </w:tc>
+      </w:tr>
+      <w:tr>
+        <w:tc>
+          <w:tcPr>
+            <w:tcW w:w="3256" w:type="dxa"/>
+            <w:tcBorders>
+              <w:top w:val="single" w:sz="24" w:space="0" w:color="EE0000"/>
+              <w:left w:val="single" w:sz="4" w:space="0" w:color="auto"/>
+              <w:bottom w:val="single" w:sz="24" w:space="0" w:color="auto"/>
+            </w:tcBorders>
+          </w:tcPr>
+          <w:p/>
+        </w:tc>
+        <w:tc>
+          <w:tcPr>
+            <w:tcW w:w="7200" w:type="dxa"/>
+            <w:tcBorders>
+              <w:top w:val="single" w:sz="24" w:space="0" w:color="EE0000"/>
+              <w:bottom w:val="single" w:sz="24" w:space="0" w:color="auto"/>
+              <w:right w:val="single" w:sz="4" w:space="0" w:color="auto"/>
+            </w:tcBorders>
+          </w:tcPr>
+          <w:p/>
+        </w:tc>
+      </w:tr>
+      <w:tr>
+        <w:tc>
+          <w:tcPr>
+            <w:tcW w:w="3256" w:type="dxa"/>
+            <w:tcBorders>
+              <w:top w:val="single" w:sz="24" w:space="0" w:color="auto"/>
+              <w:left w:val="single" w:sz="24" w:space="0" w:color="auto"/>
+            </w:tcBorders>
+          </w:tcPr>
+          <w:p>
+            <w:r>
+              <w:t>REFCODE</w:t>
+            </w:r>
+          </w:p>
+        </w:tc>
+        <w:tc>
+          <w:tcPr>
+            <w:tcW w:w="7200" w:type="dxa"/>
+            <w:tcBorders>
+              <w:top w:val="single" w:sz="24" w:space="0" w:color="auto"/>
+              <w:right w:val="single" w:sz="24" w:space="0" w:color="auto"/>
+            </w:tcBorders>
+          </w:tcPr>
+          <w:p>
+            <w:r>
+              <w:t>HOQHAW</w:t>
+            </w:r>
+          </w:p>
+        </w:tc>
+      </w:tr>
+      <w:tr>
+        <w:tc>
+          <w:tcPr>
+            <w:tcW w:w="3256" w:type="dxa"/>
+            <w:tcBorders>
+              <w:left w:val="single" w:sz="24" w:space="0" w:color="auto"/>
+            </w:tcBorders>
+          </w:tcPr>
+          <w:p>
+            <w:pPr>
+              <w:rPr>
+                <w:lang w:val="es-ES"/>
+              </w:rPr>
+            </w:pPr>
+            <w:r>
+              <w:rPr>
+                <w:lang w:val="es-ES"/>
+              </w:rPr>
+              <w:t>Formula</w:t>
+            </w:r>
+          </w:p>
+        </w:tc>
+        <w:tc>
+          <w:tcPr>
+            <w:tcW w:w="7200" w:type="dxa"/>
+            <w:tcBorders>
+              <w:right w:val="single" w:sz="24" w:space="0" w:color="auto"/>
+            </w:tcBorders>
+          </w:tcPr>
+          <w:p>
+            <w:r>
+              <w:rPr>
+                <w:lang w:val="es-ES"/>
+              </w:rPr>
+              <w:t xml:space="preserve">C3 H3 N3 O2 . </w:t>
+            </w:r>
+            <w:r>
+              <w:t>H2 O1</w:t>
+            </w:r>
+          </w:p>
+        </w:tc>
+      </w:tr>
+      <w:tr>
+        <w:tc>
+          <w:tcPr>
+            <w:tcW w:w="3256" w:type="dxa"/>
+            <w:tcBorders>
+              <w:left w:val="single" w:sz="24" w:space="0" w:color="auto"/>
+            </w:tcBorders>
+          </w:tcPr>
+          <w:p>
+            <w:r>
+              <w:t>Common Name</w:t>
+            </w:r>
+          </w:p>
+        </w:tc>
+        <w:tc>
+          <w:tcPr>
+            <w:tcW w:w="7200" w:type="dxa"/>
+            <w:tcBorders>
+              <w:right w:val="single" w:sz="24" w:space="0" w:color="auto"/>
+            </w:tcBorders>
+          </w:tcPr>
+          <w:p>
+            <w:r>
+              <w:t>5-azauracil monohydrate</w:t>
+            </w:r>
+          </w:p>
+        </w:tc>
+      </w:tr>
+      <w:tr>
+        <w:tc>
+          <w:tcPr>
+            <w:tcW w:w="3256" w:type="dxa"/>
+            <w:tcBorders>
+              <w:left w:val="single" w:sz="24" w:space="0" w:color="auto"/>
+            </w:tcBorders>
+          </w:tcPr>
+          <w:p>
+            <w:r>
+              <w:t>IUPAC Systematic Name</w:t>
+            </w:r>
+          </w:p>
+        </w:tc>
+        <w:tc>
+          <w:tcPr>
+            <w:tcW w:w="7200" w:type="dxa"/>
+            <w:tcBorders>
+              <w:right w:val="single" w:sz="24" w:space="0" w:color="auto"/>
+            </w:tcBorders>
+          </w:tcPr>
+          <w:p>
+            <w:r>
+              <w:t>1H-[1,3,5]triazin-2,4-dione monohydrate</w:t>
+            </w:r>
+          </w:p>
+        </w:tc>
+      </w:tr>
+      <w:tr>
+        <w:tc>
+          <w:tcPr>
+            <w:tcW w:w="3256" w:type="dxa"/>
+            <w:tcBorders>
+              <w:left w:val="single" w:sz="24" w:space="0" w:color="auto"/>
+            </w:tcBorders>
+          </w:tcPr>
+          <w:p>
+            <w:r>
+              <w:t>Other Names</w:t>
+            </w:r>
+          </w:p>
+        </w:tc>
+        <w:tc>
+          <w:tcPr>
+            <w:tcW w:w="7200" w:type="dxa"/>
+            <w:tcBorders>
+              <w:right w:val="single" w:sz="24" w:space="0" w:color="auto"/>
+            </w:tcBorders>
+          </w:tcPr>
+          <w:p/>
+        </w:tc>
+      </w:tr>
+      <w:tr>
+        <w:tc>
+          <w:tcPr>
+            <w:tcW w:w="3256" w:type="dxa"/>
+            <w:tcBorders>
+              <w:left w:val="single" w:sz="24" w:space="0" w:color="auto"/>
+              <w:bottom w:val="single" w:sz="24" w:space="0" w:color="auto"/>
+            </w:tcBorders>
+          </w:tcPr>
+          <w:p>
+            <w:r>
+              <w:t>CSD Refcodes</w:t>
+            </w:r>
+          </w:p>
+        </w:tc>
+        <w:tc>
+          <w:tcPr>
+            <w:tcW w:w="7200" w:type="dxa"/>
+            <w:tcBorders>
+              <w:bottom w:val="single" w:sz="24" w:space="0" w:color="auto"/>
+              <w:right w:val="single" w:sz="24" w:space="0" w:color="auto"/>
+            </w:tcBorders>
+          </w:tcPr>
+          <w:p>
+            <w:r>
+              <w:t>HOQHAW</w:t>
+            </w:r>
+          </w:p>
+        </w:tc>
+      </w:tr>
+      <w:tr>
+        <w:tc>
+          <w:tcPr>
+            <w:tcW w:w="3256" w:type="dxa"/>
+            <w:tcBorders>
+              <w:top w:val="single" w:sz="24" w:space="0" w:color="auto"/>
+              <w:bottom w:val="single" w:sz="24" w:space="0" w:color="00B0F0"/>
+            </w:tcBorders>
+          </w:tcPr>
+          <w:p/>
+        </w:tc>
+        <w:tc>
+          <w:tcPr>
+            <w:tcW w:w="7200" w:type="dxa"/>
+            <w:tcBorders>
+              <w:top w:val="single" w:sz="24" w:space="0" w:color="auto"/>
+              <w:bottom w:val="single" w:sz="24" w:space="0" w:color="00B0F0"/>
+            </w:tcBorders>
+          </w:tcPr>
+          <w:p/>
+        </w:tc>
+      </w:tr>
+      <w:tr>
+        <w:tc>
+          <w:tcPr>
+            <w:tcW w:w="3256" w:type="dxa"/>
+            <w:tcBorders>
+              <w:top w:val="single" w:sz="24" w:space="0" w:color="00B0F0"/>
+              <w:left w:val="single" w:sz="24" w:space="0" w:color="00B0F0"/>
+            </w:tcBorders>
+          </w:tcPr>
+          <w:p>
+            <w:r>
+              <w:t>Search Identifier</w:t>
+            </w:r>
+          </w:p>
+        </w:tc>
+        <w:tc>
+          <w:tcPr>
+            <w:tcW w:w="7200" w:type="dxa"/>
+            <w:tcBorders>
+              <w:top w:val="single" w:sz="24" w:space="0" w:color="00B0F0"/>
+              <w:right w:val="single" w:sz="24" w:space="0" w:color="00B0F0"/>
+            </w:tcBorders>
+          </w:tcPr>
+          <w:p>
+            <w:r>
+              <w:t>A</w:t>
+            </w:r>
+          </w:p>
+        </w:tc>
+      </w:tr>
+      <w:tr>
+        <w:tc>
+          <w:tcPr>
+            <w:tcW w:w="3256" w:type="dxa"/>
+            <w:tcBorders>
+              <w:left w:val="single" w:sz="24" w:space="0" w:color="00B0F0"/>
+            </w:tcBorders>
+          </w:tcPr>
+          <w:p>
+            <w:r>
+              <w:t>Scientist</w:t>
+            </w:r>
+          </w:p>
+        </w:tc>
+        <w:tc>
+          <w:tcPr>
+            <w:tcW w:w="7200" w:type="dxa"/>
+            <w:tcBorders>
+              <w:right w:val="single" w:sz="24" w:space="0" w:color="00B0F0"/>
+            </w:tcBorders>
+          </w:tcPr>
+          <w:p>
+            <w:r>
+              <w:t>Ashley Hulme</w:t>
+            </w:r>
+          </w:p>
+        </w:tc>
+      </w:tr>
+      <w:tr>
+        <w:tc>
+          <w:tcPr>
+            <w:tcW w:w="3256" w:type="dxa"/>
+            <w:tcBorders>
+              <w:left w:val="single" w:sz="24" w:space="0" w:color="00B0F0"/>
+            </w:tcBorders>
+          </w:tcPr>
+          <w:p>
+            <w:r>
+              <w:t>Date</w:t>
+            </w:r>
+          </w:p>
+        </w:tc>
+        <w:tc>
+          <w:tcPr>
+            <w:tcW w:w="7200" w:type="dxa"/>
+            <w:tcBorders>
+              <w:right w:val="single" w:sz="24" w:space="0" w:color="00B0F0"/>
+            </w:tcBorders>
+          </w:tcPr>
+          <w:p>
+            <w:r>
+              <w:t>2007</w:t>
+            </w:r>
+          </w:p>
+        </w:tc>
+      </w:tr>
+      <w:tr>
+        <w:tc>
+          <w:tcPr>
+            <w:tcW w:w="3256" w:type="dxa"/>
+            <w:tcBorders>
+              <w:left w:val="single" w:sz="24" w:space="0" w:color="00B0F0"/>
+              <w:bottom w:val="single" w:sz="24" w:space="0" w:color="00B0F0"/>
+            </w:tcBorders>
+          </w:tcPr>
+          <w:p>
+            <w:r>
+              <w:t>Publication</w:t>
+            </w:r>
+          </w:p>
+        </w:tc>
+        <w:tc>
+          <w:tcPr>
+            <w:tcW w:w="7200" w:type="dxa"/>
+            <w:tcBorders>
+              <w:bottom w:val="single" w:sz="24" w:space="0" w:color="00B0F0"/>
+              <w:right w:val="single" w:sz="24" w:space="0" w:color="00B0F0"/>
+            </w:tcBorders>
+          </w:tcPr>
+          <w:p>
+            <w:r>
+              <w:t>Hulme, A.T.; Price, S.L. J. Chem. Theory Comput. 2007, 3(4), 1597-1608.</w:t>
+            </w:r>
+          </w:p>
+        </w:tc>
+      </w:tr>
+      <w:tr>
+        <w:tc>
+          <w:tcPr>
+            <w:tcW w:w="3256" w:type="dxa"/>
+            <w:tcBorders>
+              <w:top w:val="single" w:sz="24" w:space="0" w:color="00B0F0"/>
+              <w:left w:val="single" w:sz="24" w:space="0" w:color="00B0F0"/>
+            </w:tcBorders>
+          </w:tcPr>
+          <w:p>
+            <w:r>
+              <w:t>Energy model</w:t>
+            </w:r>
+          </w:p>
+        </w:tc>
+        <w:tc>
+          <w:tcPr>
+            <w:tcW w:w="7200" w:type="dxa"/>
+            <w:tcBorders>
+              <w:top w:val="single" w:sz="24" w:space="0" w:color="00B0F0"/>
+              <w:right w:val="single" w:sz="24" w:space="0" w:color="00B0F0"/>
+            </w:tcBorders>
+          </w:tcPr>
+          <w:p>
+            <w:r>
+              <w:t>1</w:t>
+            </w:r>
+          </w:p>
+        </w:tc>
+      </w:tr>
+      <w:tr>
+        <w:tc>
+          <w:tcPr>
+            <w:tcW w:w="3256" w:type="dxa"/>
+            <w:tcBorders>
+              <w:left w:val="single" w:sz="24" w:space="0" w:color="00B0F0"/>
+            </w:tcBorders>
+          </w:tcPr>
+          <w:p>
+            <w:r>
+              <w:t>Study_ID</w:t>
+            </w:r>
+          </w:p>
+        </w:tc>
+        <w:tc>
+          <w:tcPr>
+            <w:tcW w:w="7200" w:type="dxa"/>
+            <w:tcBorders>
+              <w:right w:val="single" w:sz="24" w:space="0" w:color="00B0F0"/>
+            </w:tcBorders>
+          </w:tcPr>
+          <w:p>
+            <w:r>
+              <w:t>0</w:t>
+            </w:r>
+          </w:p>
+        </w:tc>
+      </w:tr>
+      <w:tr>
+        <w:tc>
+          <w:tcPr>
+            <w:tcW w:w="3256" w:type="dxa"/>
+            <w:tcBorders>
+              <w:left w:val="single" w:sz="24" w:space="0" w:color="00B0F0"/>
+            </w:tcBorders>
+          </w:tcPr>
+          <w:p>
+            <w:r>
+              <w:t>Programs</w:t>
+            </w:r>
+          </w:p>
+        </w:tc>
+        <w:tc>
+          <w:tcPr>
+            <w:tcW w:w="7200" w:type="dxa"/>
+            <w:tcBorders>
+              <w:right w:val="single" w:sz="24" w:space="0" w:color="00B0F0"/>
+            </w:tcBorders>
+          </w:tcPr>
+          <w:p>
+            <w:r>
+              <w:t>MOLPAK, DMAREL (3.11)</w:t>
+            </w:r>
+          </w:p>
+        </w:tc>
+      </w:tr>
+      <w:tr>
+        <w:tc>
+          <w:tcPr>
+            <w:tcW w:w="3256" w:type="dxa"/>
+            <w:tcBorders>
+              <w:left w:val="single" w:sz="24" w:space="0" w:color="00B0F0"/>
+            </w:tcBorders>
+          </w:tcPr>
+          <w:p>
+            <w:r>
+              <w:t>Location on S Drive</w:t>
+            </w:r>
+          </w:p>
+        </w:tc>
+        <w:tc>
+          <w:tcPr>
+            <w:tcW w:w="7200" w:type="dxa"/>
+            <w:tcBorders>
+              <w:right w:val="single" w:sz="24" w:space="0" w:color="00B0F0"/>
+            </w:tcBorders>
+          </w:tcPr>
+          <w:p>
+            <w:r>
+              <w:t>\CHEMISTRY_CPOSS\0-EarlySearches\home\louise_price.eminerals\5azahydrates</w:t>
+            </w:r>
+          </w:p>
+        </w:tc>
+      </w:tr>
+      <w:tr>
+        <w:tc>
+          <w:tcPr>
+            <w:tcW w:w="3256" w:type="dxa"/>
+            <w:tcBorders>
+              <w:left w:val="single" w:sz="24" w:space="0" w:color="00B0F0"/>
+            </w:tcBorders>
+          </w:tcPr>
+          <w:p>
+            <w:r>
+              <w:t>Potential Description</w:t>
+            </w:r>
+          </w:p>
+        </w:tc>
+        <w:tc>
+          <w:tcPr>
+            <w:tcW w:w="7200" w:type="dxa"/>
+            <w:tcBorders>
+              <w:right w:val="single" w:sz="24" w:space="0" w:color="00B0F0"/>
+            </w:tcBorders>
+          </w:tcPr>
+          <w:p>
+            <w:r>
+              <w:t>DMA + FIT</w:t>
+            </w:r>
+          </w:p>
+        </w:tc>
+      </w:tr>
+      <w:tr>
+        <w:tc>
+          <w:tcPr>
+            <w:tcW w:w="3256" w:type="dxa"/>
+            <w:tcBorders>
+              <w:left w:val="single" w:sz="24" w:space="0" w:color="00B0F0"/>
+              <w:bottom w:val="single" w:sz="24" w:space="0" w:color="00B0F0"/>
+            </w:tcBorders>
+          </w:tcPr>
+          <w:p>
+            <w:r>
+              <w:t>Intramolecular Description</w:t>
+            </w:r>
+          </w:p>
+        </w:tc>
+        <w:tc>
+          <w:tcPr>
+            <w:tcW w:w="7200" w:type="dxa"/>
+            <w:tcBorders>
+              <w:bottom w:val="single" w:sz="24" w:space="0" w:color="00B0F0"/>
+              <w:right w:val="single" w:sz="24" w:space="0" w:color="00B0F0"/>
+            </w:tcBorders>
+          </w:tcPr>
+          <w:p>
+            <w:r>
+              <w:t>MP2/6-31G(d,p)</w:t>
             </w:r>
           </w:p>
         </w:tc>
       </w:tr>
     </w:tbl>
-    <w:p>
-      <w:pPr>
-        <w:rPr>
-          <w:lang w:val="en-US"/>
-        </w:rPr>
-      </w:pPr>
-    </w:p>
+    <w:p/>
     <w:p>
       <w:pPr>
         <w:rPr>
@@ -954,9 +1427,9 @@
         </w:rPr>
         <w:lastRenderedPageBreak/>
         <w:drawing>
-          <wp:inline distT="0" distB="0" distL="0" distR="0" wp14:anchorId="6955DA15" wp14:editId="35903AFF">
-            <wp:extent cx="6480000" cy="4704190"/>
-            <wp:effectExtent l="0" t="0" r="0" b="1270"/>
+          <wp:inline distT="0" distB="0" distL="0" distR="0" wp14:anchorId="6955DA15" wp14:editId="6DE00285">
+            <wp:extent cx="3240000" cy="2352095"/>
+            <wp:effectExtent l="0" t="0" r="0" b="0"/>
             <wp:docPr id="1359378426" name="Picture 1"/>
             <wp:cNvGraphicFramePr>
               <a:graphicFrameLocks xmlns:a="http://schemas.openxmlformats.org/drawingml/2006/main" noChangeAspect="1"/>
@@ -971,7 +1444,7 @@
                     </pic:cNvPicPr>
                   </pic:nvPicPr>
                   <pic:blipFill>
-                    <a:blip r:embed="rId8">
+                    <a:blip r:embed="rId8" cstate="print">
                       <a:extLst>
                         <a:ext uri="{28A0092B-C50C-407E-A947-70E740481C1C}">
                           <a14:useLocalDpi xmlns:a14="http://schemas.microsoft.com/office/drawing/2010/main" val="0"/>
@@ -986,7 +1459,58 @@
                   <pic:spPr bwMode="auto">
                     <a:xfrm>
                       <a:off x="0" y="0"/>
-                      <a:ext cx="6480000" cy="4704190"/>
+                      <a:ext cx="3240000" cy="2352095"/>
+                    </a:xfrm>
+                    <a:prstGeom prst="rect">
+                      <a:avLst/>
+                    </a:prstGeom>
+                    <a:noFill/>
+                  </pic:spPr>
+                </pic:pic>
+              </a:graphicData>
+            </a:graphic>
+          </wp:inline>
+        </w:drawing>
+      </w:r>
+      <w:r>
+        <w:rPr>
+          <w:noProof/>
+          <w:lang w:val="en-US"/>
+        </w:rPr>
+        <w:drawing>
+          <wp:inline distT="0" distB="0" distL="0" distR="0" wp14:anchorId="4576F535" wp14:editId="6802E34E">
+            <wp:extent cx="3240000" cy="2352095"/>
+            <wp:effectExtent l="0" t="0" r="0" b="0"/>
+            <wp:docPr id="1568257865" name="Picture 1"/>
+            <wp:cNvGraphicFramePr>
+              <a:graphicFrameLocks xmlns:a="http://schemas.openxmlformats.org/drawingml/2006/main" noChangeAspect="1"/>
+            </wp:cNvGraphicFramePr>
+            <a:graphic xmlns:a="http://schemas.openxmlformats.org/drawingml/2006/main">
+              <a:graphicData uri="http://schemas.openxmlformats.org/drawingml/2006/picture">
+                <pic:pic xmlns:pic="http://schemas.openxmlformats.org/drawingml/2006/picture">
+                  <pic:nvPicPr>
+                    <pic:cNvPr id="0" name="Picture 3"/>
+                    <pic:cNvPicPr>
+                      <a:picLocks noChangeAspect="1" noChangeArrowheads="1"/>
+                    </pic:cNvPicPr>
+                  </pic:nvPicPr>
+                  <pic:blipFill>
+                    <a:blip r:embed="rId9" cstate="print">
+                      <a:extLst>
+                        <a:ext uri="{28A0092B-C50C-407E-A947-70E740481C1C}">
+                          <a14:useLocalDpi xmlns:a14="http://schemas.microsoft.com/office/drawing/2010/main" val="0"/>
+                        </a:ext>
+                      </a:extLst>
+                    </a:blip>
+                    <a:srcRect/>
+                    <a:stretch>
+                      <a:fillRect/>
+                    </a:stretch>
+                  </pic:blipFill>
+                  <pic:spPr bwMode="auto">
+                    <a:xfrm>
+                      <a:off x="0" y="0"/>
+                      <a:ext cx="3240000" cy="2352095"/>
                     </a:xfrm>
                     <a:prstGeom prst="rect">
                       <a:avLst/>
@@ -1025,6 +1549,9 @@
       </w:r>
       <w:r>
         <w:t xml:space="preserve"> from previous work.</w:t>
+      </w:r>
+      <w:r>
+        <w:t xml:space="preserve">  Left: Anhydrous.  Right: Monohydrate.</w:t>
       </w:r>
     </w:p>
     <w:p>
@@ -1118,22 +1645,25 @@
         <w:tblLook w:val="04A0" w:firstRow="1" w:lastRow="0" w:firstColumn="1" w:lastColumn="0" w:noHBand="0" w:noVBand="1"/>
       </w:tblPr>
       <w:tblGrid>
-        <w:gridCol w:w="1169"/>
-        <w:gridCol w:w="953"/>
-        <w:gridCol w:w="858"/>
+        <w:gridCol w:w="1160"/>
+        <w:gridCol w:w="933"/>
+        <w:gridCol w:w="806"/>
         <w:gridCol w:w="941"/>
         <w:gridCol w:w="941"/>
-        <w:gridCol w:w="931"/>
-        <w:gridCol w:w="877"/>
-        <w:gridCol w:w="935"/>
-        <w:gridCol w:w="897"/>
-        <w:gridCol w:w="991"/>
-        <w:gridCol w:w="963"/>
+        <w:gridCol w:w="917"/>
+        <w:gridCol w:w="839"/>
+        <w:gridCol w:w="1164"/>
+        <w:gridCol w:w="856"/>
+        <w:gridCol w:w="973"/>
+        <w:gridCol w:w="926"/>
       </w:tblGrid>
       <w:tr>
         <w:tc>
           <w:tcPr>
             <w:tcW w:w="1169" w:type="dxa"/>
+            <w:tcBorders>
+              <w:bottom w:val="single" w:sz="24" w:space="0" w:color="auto"/>
+            </w:tcBorders>
           </w:tcPr>
           <w:p>
             <w:pPr>
@@ -1152,6 +1682,9 @@
         <w:tc>
           <w:tcPr>
             <w:tcW w:w="953" w:type="dxa"/>
+            <w:tcBorders>
+              <w:bottom w:val="single" w:sz="24" w:space="0" w:color="auto"/>
+            </w:tcBorders>
           </w:tcPr>
           <w:p>
             <w:pPr>
@@ -1170,6 +1703,9 @@
         <w:tc>
           <w:tcPr>
             <w:tcW w:w="858" w:type="dxa"/>
+            <w:tcBorders>
+              <w:bottom w:val="single" w:sz="24" w:space="0" w:color="auto"/>
+            </w:tcBorders>
           </w:tcPr>
           <w:p>
             <w:pPr>
@@ -1188,6 +1724,9 @@
         <w:tc>
           <w:tcPr>
             <w:tcW w:w="941" w:type="dxa"/>
+            <w:tcBorders>
+              <w:bottom w:val="single" w:sz="24" w:space="0" w:color="auto"/>
+            </w:tcBorders>
           </w:tcPr>
           <w:p>
             <w:pPr>
@@ -1206,6 +1745,9 @@
         <w:tc>
           <w:tcPr>
             <w:tcW w:w="941" w:type="dxa"/>
+            <w:tcBorders>
+              <w:bottom w:val="single" w:sz="24" w:space="0" w:color="auto"/>
+            </w:tcBorders>
           </w:tcPr>
           <w:p>
             <w:pPr>
@@ -1224,6 +1766,9 @@
         <w:tc>
           <w:tcPr>
             <w:tcW w:w="931" w:type="dxa"/>
+            <w:tcBorders>
+              <w:bottom w:val="single" w:sz="24" w:space="0" w:color="auto"/>
+            </w:tcBorders>
           </w:tcPr>
           <w:p>
             <w:pPr>
@@ -1242,6 +1787,9 @@
         <w:tc>
           <w:tcPr>
             <w:tcW w:w="877" w:type="dxa"/>
+            <w:tcBorders>
+              <w:bottom w:val="single" w:sz="24" w:space="0" w:color="auto"/>
+            </w:tcBorders>
           </w:tcPr>
           <w:p>
             <w:pPr>
@@ -1267,6 +1815,9 @@
         <w:tc>
           <w:tcPr>
             <w:tcW w:w="935" w:type="dxa"/>
+            <w:tcBorders>
+              <w:bottom w:val="single" w:sz="24" w:space="0" w:color="auto"/>
+            </w:tcBorders>
           </w:tcPr>
           <w:p>
             <w:pPr>
@@ -1292,6 +1843,9 @@
         <w:tc>
           <w:tcPr>
             <w:tcW w:w="897" w:type="dxa"/>
+            <w:tcBorders>
+              <w:bottom w:val="single" w:sz="24" w:space="0" w:color="auto"/>
+            </w:tcBorders>
           </w:tcPr>
           <w:p>
             <w:pPr>
@@ -1317,6 +1871,9 @@
         <w:tc>
           <w:tcPr>
             <w:tcW w:w="991" w:type="dxa"/>
+            <w:tcBorders>
+              <w:bottom w:val="single" w:sz="24" w:space="0" w:color="auto"/>
+            </w:tcBorders>
           </w:tcPr>
           <w:p>
             <w:pPr>
@@ -1342,6 +1899,9 @@
         <w:tc>
           <w:tcPr>
             <w:tcW w:w="963" w:type="dxa"/>
+            <w:tcBorders>
+              <w:bottom w:val="single" w:sz="24" w:space="0" w:color="auto"/>
+            </w:tcBorders>
           </w:tcPr>
           <w:p>
             <w:pPr>
@@ -1362,6 +1922,11 @@
         <w:tc>
           <w:tcPr>
             <w:tcW w:w="1169" w:type="dxa"/>
+            <w:tcBorders>
+              <w:top w:val="single" w:sz="24" w:space="0" w:color="auto"/>
+              <w:left w:val="single" w:sz="24" w:space="0" w:color="auto"/>
+              <w:bottom w:val="single" w:sz="24" w:space="0" w:color="auto"/>
+            </w:tcBorders>
             <w:shd w:val="clear" w:color="auto" w:fill="C5E0B3" w:themeFill="accent6" w:themeFillTint="66"/>
           </w:tcPr>
           <w:p>
@@ -1381,6 +1946,10 @@
         <w:tc>
           <w:tcPr>
             <w:tcW w:w="953" w:type="dxa"/>
+            <w:tcBorders>
+              <w:top w:val="single" w:sz="24" w:space="0" w:color="auto"/>
+              <w:bottom w:val="single" w:sz="24" w:space="0" w:color="auto"/>
+            </w:tcBorders>
             <w:shd w:val="clear" w:color="auto" w:fill="C5E0B3" w:themeFill="accent6" w:themeFillTint="66"/>
           </w:tcPr>
           <w:p>
@@ -1389,19 +1958,21 @@
                 <w:lang w:val="en-US"/>
               </w:rPr>
             </w:pPr>
-            <w:proofErr w:type="spellStart"/>
             <w:r>
               <w:rPr>
                 <w:lang w:val="en-US"/>
               </w:rPr>
               <w:t>Pbca</w:t>
             </w:r>
-            <w:proofErr w:type="spellEnd"/>
           </w:p>
         </w:tc>
         <w:tc>
           <w:tcPr>
             <w:tcW w:w="858" w:type="dxa"/>
+            <w:tcBorders>
+              <w:top w:val="single" w:sz="24" w:space="0" w:color="auto"/>
+              <w:bottom w:val="single" w:sz="24" w:space="0" w:color="auto"/>
+            </w:tcBorders>
             <w:shd w:val="clear" w:color="auto" w:fill="C5E0B3" w:themeFill="accent6" w:themeFillTint="66"/>
           </w:tcPr>
           <w:p>
@@ -1421,6 +1992,10 @@
         <w:tc>
           <w:tcPr>
             <w:tcW w:w="941" w:type="dxa"/>
+            <w:tcBorders>
+              <w:top w:val="single" w:sz="24" w:space="0" w:color="auto"/>
+              <w:bottom w:val="single" w:sz="24" w:space="0" w:color="auto"/>
+            </w:tcBorders>
             <w:shd w:val="clear" w:color="auto" w:fill="C5E0B3" w:themeFill="accent6" w:themeFillTint="66"/>
           </w:tcPr>
           <w:p>
@@ -1440,6 +2015,10 @@
         <w:tc>
           <w:tcPr>
             <w:tcW w:w="941" w:type="dxa"/>
+            <w:tcBorders>
+              <w:top w:val="single" w:sz="24" w:space="0" w:color="auto"/>
+              <w:bottom w:val="single" w:sz="24" w:space="0" w:color="auto"/>
+            </w:tcBorders>
             <w:shd w:val="clear" w:color="auto" w:fill="C5E0B3" w:themeFill="accent6" w:themeFillTint="66"/>
           </w:tcPr>
           <w:p>
@@ -1459,6 +2038,10 @@
         <w:tc>
           <w:tcPr>
             <w:tcW w:w="931" w:type="dxa"/>
+            <w:tcBorders>
+              <w:top w:val="single" w:sz="24" w:space="0" w:color="auto"/>
+              <w:bottom w:val="single" w:sz="24" w:space="0" w:color="auto"/>
+            </w:tcBorders>
             <w:shd w:val="clear" w:color="auto" w:fill="C5E0B3" w:themeFill="accent6" w:themeFillTint="66"/>
           </w:tcPr>
           <w:p>
@@ -1478,6 +2061,10 @@
         <w:tc>
           <w:tcPr>
             <w:tcW w:w="877" w:type="dxa"/>
+            <w:tcBorders>
+              <w:top w:val="single" w:sz="24" w:space="0" w:color="auto"/>
+              <w:bottom w:val="single" w:sz="24" w:space="0" w:color="auto"/>
+            </w:tcBorders>
             <w:shd w:val="clear" w:color="auto" w:fill="C5E0B3" w:themeFill="accent6" w:themeFillTint="66"/>
           </w:tcPr>
           <w:p>
@@ -1497,6 +2084,10 @@
         <w:tc>
           <w:tcPr>
             <w:tcW w:w="935" w:type="dxa"/>
+            <w:tcBorders>
+              <w:top w:val="single" w:sz="24" w:space="0" w:color="auto"/>
+              <w:bottom w:val="single" w:sz="24" w:space="0" w:color="auto"/>
+            </w:tcBorders>
             <w:shd w:val="clear" w:color="auto" w:fill="C5E0B3" w:themeFill="accent6" w:themeFillTint="66"/>
           </w:tcPr>
           <w:p>
@@ -1516,6 +2107,10 @@
         <w:tc>
           <w:tcPr>
             <w:tcW w:w="897" w:type="dxa"/>
+            <w:tcBorders>
+              <w:top w:val="single" w:sz="24" w:space="0" w:color="auto"/>
+              <w:bottom w:val="single" w:sz="24" w:space="0" w:color="auto"/>
+            </w:tcBorders>
             <w:shd w:val="clear" w:color="auto" w:fill="C5E0B3" w:themeFill="accent6" w:themeFillTint="66"/>
           </w:tcPr>
           <w:p>
@@ -1535,6 +2130,10 @@
         <w:tc>
           <w:tcPr>
             <w:tcW w:w="991" w:type="dxa"/>
+            <w:tcBorders>
+              <w:top w:val="single" w:sz="24" w:space="0" w:color="auto"/>
+              <w:bottom w:val="single" w:sz="24" w:space="0" w:color="auto"/>
+            </w:tcBorders>
             <w:shd w:val="clear" w:color="auto" w:fill="C5E0B3" w:themeFill="accent6" w:themeFillTint="66"/>
           </w:tcPr>
           <w:p>
@@ -1554,6 +2153,11 @@
         <w:tc>
           <w:tcPr>
             <w:tcW w:w="963" w:type="dxa"/>
+            <w:tcBorders>
+              <w:top w:val="single" w:sz="24" w:space="0" w:color="auto"/>
+              <w:bottom w:val="single" w:sz="24" w:space="0" w:color="auto"/>
+              <w:right w:val="single" w:sz="24" w:space="0" w:color="auto"/>
+            </w:tcBorders>
             <w:shd w:val="clear" w:color="auto" w:fill="C5E0B3" w:themeFill="accent6" w:themeFillTint="66"/>
           </w:tcPr>
           <w:p>
@@ -1561,6 +2165,263 @@
               <w:rPr>
                 <w:rFonts w:ascii="Calibri" w:hAnsi="Calibri" w:cs="Calibri"/>
                 <w:color w:val="000000"/>
+              </w:rPr>
+            </w:pPr>
+            <w:r>
+              <w:rPr>
+                <w:lang w:val="en-US"/>
+              </w:rPr>
+              <w:t>None</w:t>
+            </w:r>
+          </w:p>
+        </w:tc>
+      </w:tr>
+      <w:tr>
+        <w:tc>
+          <w:tcPr>
+            <w:tcW w:w="1169" w:type="dxa"/>
+            <w:tcBorders>
+              <w:top w:val="single" w:sz="24" w:space="0" w:color="auto"/>
+              <w:left w:val="single" w:sz="24" w:space="0" w:color="auto"/>
+              <w:bottom w:val="single" w:sz="24" w:space="0" w:color="auto"/>
+            </w:tcBorders>
+            <w:shd w:val="clear" w:color="auto" w:fill="FFE599" w:themeFill="accent4" w:themeFillTint="66"/>
+          </w:tcPr>
+          <w:p>
+            <w:pPr>
+              <w:rPr>
+                <w:lang w:val="en-US"/>
+              </w:rPr>
+            </w:pPr>
+            <w:r>
+              <w:rPr>
+                <w:lang w:val="en-US"/>
+              </w:rPr>
+              <w:t>HOQHAW</w:t>
+            </w:r>
+          </w:p>
+        </w:tc>
+        <w:tc>
+          <w:tcPr>
+            <w:tcW w:w="953" w:type="dxa"/>
+            <w:tcBorders>
+              <w:top w:val="single" w:sz="24" w:space="0" w:color="auto"/>
+              <w:bottom w:val="single" w:sz="24" w:space="0" w:color="auto"/>
+            </w:tcBorders>
+            <w:shd w:val="clear" w:color="auto" w:fill="FFE599" w:themeFill="accent4" w:themeFillTint="66"/>
+          </w:tcPr>
+          <w:p>
+            <w:pPr>
+              <w:rPr>
+                <w:lang w:val="en-US"/>
+              </w:rPr>
+            </w:pPr>
+            <w:r>
+              <w:rPr>
+                <w:lang w:val="en-US"/>
+              </w:rPr>
+              <w:t>P21/m</w:t>
+            </w:r>
+          </w:p>
+        </w:tc>
+        <w:tc>
+          <w:tcPr>
+            <w:tcW w:w="858" w:type="dxa"/>
+            <w:tcBorders>
+              <w:top w:val="single" w:sz="24" w:space="0" w:color="auto"/>
+              <w:bottom w:val="single" w:sz="24" w:space="0" w:color="auto"/>
+            </w:tcBorders>
+            <w:shd w:val="clear" w:color="auto" w:fill="FFE599" w:themeFill="accent4" w:themeFillTint="66"/>
+          </w:tcPr>
+          <w:p>
+            <w:pPr>
+              <w:rPr>
+                <w:lang w:val="en-US"/>
+              </w:rPr>
+            </w:pPr>
+            <w:r>
+              <w:rPr>
+                <w:lang w:val="en-US"/>
+              </w:rPr>
+              <w:t>0.5</w:t>
+            </w:r>
+          </w:p>
+        </w:tc>
+        <w:tc>
+          <w:tcPr>
+            <w:tcW w:w="941" w:type="dxa"/>
+            <w:tcBorders>
+              <w:top w:val="single" w:sz="24" w:space="0" w:color="auto"/>
+              <w:bottom w:val="single" w:sz="24" w:space="0" w:color="auto"/>
+            </w:tcBorders>
+            <w:shd w:val="clear" w:color="auto" w:fill="FFE599" w:themeFill="accent4" w:themeFillTint="66"/>
+          </w:tcPr>
+          <w:p>
+            <w:pPr>
+              <w:rPr>
+                <w:lang w:val="en-US"/>
+              </w:rPr>
+            </w:pPr>
+            <w:r>
+              <w:rPr>
+                <w:lang w:val="en-US"/>
+              </w:rPr>
+              <w:t>6.4316</w:t>
+            </w:r>
+          </w:p>
+        </w:tc>
+        <w:tc>
+          <w:tcPr>
+            <w:tcW w:w="941" w:type="dxa"/>
+            <w:tcBorders>
+              <w:top w:val="single" w:sz="24" w:space="0" w:color="auto"/>
+              <w:bottom w:val="single" w:sz="24" w:space="0" w:color="auto"/>
+            </w:tcBorders>
+            <w:shd w:val="clear" w:color="auto" w:fill="FFE599" w:themeFill="accent4" w:themeFillTint="66"/>
+          </w:tcPr>
+          <w:p>
+            <w:pPr>
+              <w:rPr>
+                <w:lang w:val="en-US"/>
+              </w:rPr>
+            </w:pPr>
+            <w:r>
+              <w:rPr>
+                <w:lang w:val="en-US"/>
+              </w:rPr>
+              <w:t>6.2108</w:t>
+            </w:r>
+          </w:p>
+        </w:tc>
+        <w:tc>
+          <w:tcPr>
+            <w:tcW w:w="931" w:type="dxa"/>
+            <w:tcBorders>
+              <w:top w:val="single" w:sz="24" w:space="0" w:color="auto"/>
+              <w:bottom w:val="single" w:sz="24" w:space="0" w:color="auto"/>
+            </w:tcBorders>
+            <w:shd w:val="clear" w:color="auto" w:fill="FFE599" w:themeFill="accent4" w:themeFillTint="66"/>
+          </w:tcPr>
+          <w:p>
+            <w:pPr>
+              <w:rPr>
+                <w:lang w:val="en-US"/>
+              </w:rPr>
+            </w:pPr>
+            <w:r>
+              <w:rPr>
+                <w:lang w:val="en-US"/>
+              </w:rPr>
+              <w:t>6.8205</w:t>
+            </w:r>
+          </w:p>
+        </w:tc>
+        <w:tc>
+          <w:tcPr>
+            <w:tcW w:w="877" w:type="dxa"/>
+            <w:tcBorders>
+              <w:top w:val="single" w:sz="24" w:space="0" w:color="auto"/>
+              <w:bottom w:val="single" w:sz="24" w:space="0" w:color="auto"/>
+            </w:tcBorders>
+            <w:shd w:val="clear" w:color="auto" w:fill="FFE599" w:themeFill="accent4" w:themeFillTint="66"/>
+          </w:tcPr>
+          <w:p>
+            <w:pPr>
+              <w:rPr>
+                <w:lang w:val="en-US"/>
+              </w:rPr>
+            </w:pPr>
+            <w:r>
+              <w:rPr>
+                <w:lang w:val="en-US"/>
+              </w:rPr>
+              <w:t>90.0</w:t>
+            </w:r>
+          </w:p>
+        </w:tc>
+        <w:tc>
+          <w:tcPr>
+            <w:tcW w:w="935" w:type="dxa"/>
+            <w:tcBorders>
+              <w:top w:val="single" w:sz="24" w:space="0" w:color="auto"/>
+              <w:bottom w:val="single" w:sz="24" w:space="0" w:color="auto"/>
+            </w:tcBorders>
+            <w:shd w:val="clear" w:color="auto" w:fill="FFE599" w:themeFill="accent4" w:themeFillTint="66"/>
+          </w:tcPr>
+          <w:p>
+            <w:pPr>
+              <w:rPr>
+                <w:lang w:val="en-US"/>
+              </w:rPr>
+            </w:pPr>
+            <w:r>
+              <w:rPr>
+                <w:lang w:val="en-US"/>
+              </w:rPr>
+              <w:t>99.719000</w:t>
+            </w:r>
+          </w:p>
+        </w:tc>
+        <w:tc>
+          <w:tcPr>
+            <w:tcW w:w="897" w:type="dxa"/>
+            <w:tcBorders>
+              <w:top w:val="single" w:sz="24" w:space="0" w:color="auto"/>
+              <w:bottom w:val="single" w:sz="24" w:space="0" w:color="auto"/>
+            </w:tcBorders>
+            <w:shd w:val="clear" w:color="auto" w:fill="FFE599" w:themeFill="accent4" w:themeFillTint="66"/>
+          </w:tcPr>
+          <w:p>
+            <w:pPr>
+              <w:rPr>
+                <w:lang w:val="en-US"/>
+              </w:rPr>
+            </w:pPr>
+            <w:r>
+              <w:rPr>
+                <w:lang w:val="en-US"/>
+              </w:rPr>
+              <w:t>90.0</w:t>
+            </w:r>
+          </w:p>
+        </w:tc>
+        <w:tc>
+          <w:tcPr>
+            <w:tcW w:w="991" w:type="dxa"/>
+            <w:tcBorders>
+              <w:top w:val="single" w:sz="24" w:space="0" w:color="auto"/>
+              <w:bottom w:val="single" w:sz="24" w:space="0" w:color="auto"/>
+            </w:tcBorders>
+            <w:shd w:val="clear" w:color="auto" w:fill="FFE599" w:themeFill="accent4" w:themeFillTint="66"/>
+          </w:tcPr>
+          <w:p>
+            <w:pPr>
+              <w:rPr>
+                <w:lang w:val="en-US"/>
+              </w:rPr>
+            </w:pPr>
+            <w:r>
+              <w:rPr>
+                <w:lang w:val="en-US"/>
+              </w:rPr>
+              <w:t>1.6212</w:t>
+            </w:r>
+          </w:p>
+        </w:tc>
+        <w:tc>
+          <w:tcPr>
+            <w:tcW w:w="963" w:type="dxa"/>
+            <w:tcBorders>
+              <w:top w:val="single" w:sz="24" w:space="0" w:color="auto"/>
+              <w:bottom w:val="single" w:sz="24" w:space="0" w:color="auto"/>
+              <w:right w:val="single" w:sz="24" w:space="0" w:color="auto"/>
+            </w:tcBorders>
+            <w:shd w:val="clear" w:color="auto" w:fill="FFE599" w:themeFill="accent4" w:themeFillTint="66"/>
+          </w:tcPr>
+          <w:p>
+            <w:pPr>
+              <w:rPr>
+                <w:lang w:val="en-US"/>
               </w:rPr>
             </w:pPr>
             <w:r>
@@ -1614,7 +2475,7 @@
         <w:tblLook w:val="04A0" w:firstRow="1" w:lastRow="0" w:firstColumn="1" w:lastColumn="0" w:noHBand="0" w:noVBand="1"/>
       </w:tblPr>
       <w:tblGrid>
-        <w:gridCol w:w="1050"/>
+        <w:gridCol w:w="1107"/>
         <w:gridCol w:w="1303"/>
         <w:gridCol w:w="918"/>
         <w:gridCol w:w="700"/>
@@ -1760,14 +2621,12 @@
                 <w:lang w:val="en-US"/>
               </w:rPr>
             </w:pPr>
-            <w:proofErr w:type="spellStart"/>
             <w:r>
               <w:rPr>
                 <w:lang w:val="en-US"/>
               </w:rPr>
               <w:t>Pbca</w:t>
             </w:r>
-            <w:proofErr w:type="spellEnd"/>
           </w:p>
         </w:tc>
         <w:tc>
@@ -1843,6 +2702,116 @@
                 <w:lang w:val="en-US"/>
               </w:rPr>
               <w:t>10.1016/S0022-2860(98)00849-7</w:t>
+            </w:r>
+          </w:p>
+        </w:tc>
+      </w:tr>
+      <w:tr>
+        <w:tc>
+          <w:tcPr>
+            <w:tcW w:w="0" w:type="auto"/>
+          </w:tcPr>
+          <w:p>
+            <w:pPr>
+              <w:rPr>
+                <w:lang w:val="en-US"/>
+              </w:rPr>
+            </w:pPr>
+            <w:r>
+              <w:rPr>
+                <w:lang w:val="en-US"/>
+              </w:rPr>
+              <w:t>HOQHAW</w:t>
+            </w:r>
+          </w:p>
+        </w:tc>
+        <w:tc>
+          <w:tcPr>
+            <w:tcW w:w="0" w:type="auto"/>
+          </w:tcPr>
+          <w:p>
+            <w:pPr>
+              <w:rPr>
+                <w:lang w:val="en-US"/>
+              </w:rPr>
+            </w:pPr>
+            <w:r>
+              <w:rPr>
+                <w:lang w:val="en-US"/>
+              </w:rPr>
+              <w:t>P21/m</w:t>
+            </w:r>
+          </w:p>
+        </w:tc>
+        <w:tc>
+          <w:tcPr>
+            <w:tcW w:w="0" w:type="auto"/>
+          </w:tcPr>
+          <w:p>
+            <w:pPr>
+              <w:rPr>
+                <w:lang w:val="en-US"/>
+              </w:rPr>
+            </w:pPr>
+            <w:r>
+              <w:rPr>
+                <w:lang w:val="en-US"/>
+              </w:rPr>
+              <w:t>3.320</w:t>
+            </w:r>
+          </w:p>
+        </w:tc>
+        <w:tc>
+          <w:tcPr>
+            <w:tcW w:w="0" w:type="auto"/>
+          </w:tcPr>
+          <w:p>
+            <w:pPr>
+              <w:rPr>
+                <w:lang w:val="en-US"/>
+              </w:rPr>
+            </w:pPr>
+            <w:r>
+              <w:rPr>
+                <w:lang w:val="en-US"/>
+              </w:rPr>
+              <w:t>None</w:t>
+            </w:r>
+          </w:p>
+        </w:tc>
+        <w:tc>
+          <w:tcPr>
+            <w:tcW w:w="0" w:type="auto"/>
+          </w:tcPr>
+          <w:p>
+            <w:pPr>
+              <w:rPr>
+                <w:lang w:val="en-US"/>
+              </w:rPr>
+            </w:pPr>
+            <w:r>
+              <w:rPr>
+                <w:lang w:val="en-US"/>
+              </w:rPr>
+              <w:t>1999</w:t>
+            </w:r>
+          </w:p>
+        </w:tc>
+        <w:tc>
+          <w:tcPr>
+            <w:tcW w:w="0" w:type="auto"/>
+          </w:tcPr>
+          <w:p>
+            <w:pPr>
+              <w:rPr>
+                <w:lang w:val="en-US"/>
+              </w:rPr>
+            </w:pPr>
+            <w:r>
+              <w:rPr>
+                <w:lang w:val="en-US"/>
+              </w:rPr>
+              <w:t>10.1039/a804613a</w:t>
             </w:r>
           </w:p>
         </w:tc>

</xml_diff>